<commit_message>
Scope Amendment v2.1 — decision 1 confirmed: EFA + reliabilities only per Dr. Rey Jun 30; mediation struck from Plan v2 + TASKS; playbook adds both-rotations rule + outlier analysis; tracker aligned to Jul 11 / Jul 9 gate
Co-Authored-By: Claude Fable 5 <noreply@anthropic.com>
Claude-Session: https://claude.ai/code/session_019uQWfMoV11me5yJ6LYRtPv
</commit_message>
<xml_diff>
--- a/dba/EFA_Reliability_Playbook.docx
+++ b/dba/EFA_Reliability_Playbook.docx
@@ -339,6 +339,29 @@
         <w:rPr>
           <w:b/>
         </w:rPr>
+        <w:t>Outlier analysis (its own Results subsection — both course exemplars report it):</w:t>
+      </w:r>
+      <w:r>
+        <w:t xml:space="preserve"> after cleaning, screen each construct with </w:t>
+      </w:r>
+      <w:r>
+        <w:rPr>
+          <w:b/>
+        </w:rPr>
+        <w:t>boxplots and z-scores</w:t>
+      </w:r>
+      <w:r>
+        <w:t xml:space="preserve"> (|z| &gt; 3.29 as the conventional flag); document every keep/drop decision with a one-line rationale in the exclusion log. Removal is the exception, not the rule — an extreme-but-genuine professional opinion is data, not noise.</w:t>
+      </w:r>
+    </w:p>
+    <w:p>
+      <w:pPr>
+        <w:pStyle w:val="ListNumber"/>
+      </w:pPr>
+      <w:r>
+        <w:rPr>
+          <w:b/>
+        </w:rPr>
         <w:t>⚠ Reverse-code the (R) items</w:t>
       </w:r>
       <w:r>
@@ -507,16 +530,25 @@
         <w:t>Rotation</w:t>
       </w:r>
       <w:r>
-        <w:t xml:space="preserve"> button → </w:t>
+        <w:t xml:space="preserve"> button → run the analysis </w:t>
       </w:r>
       <w:r>
         <w:rPr>
           <w:b/>
         </w:rPr>
-        <w:t>Direct Oblimin</w:t>
+        <w:t>twice — once with Varimax, once with Direct Oblimin</w:t>
       </w:r>
       <w:r>
-        <w:t>.</w:t>
+        <w:t xml:space="preserve"> (one rotation per run, exactly as Assignment 4 teaches). </w:t>
+      </w:r>
+      <w:r>
+        <w:rPr>
+          <w:b/>
+        </w:rPr>
+        <w:t>Report Direct Oblimin</w:t>
+      </w:r>
+      <w:r>
+        <w:t xml:space="preserve"> with the theoretical justification that the constructs are correlated; the Varimax run is your comparison evidence that the solution is stable across rotations.</w:t>
       </w:r>
     </w:p>
     <w:p>

</xml_diff>